<commit_message>
fix(appsheet): documentar recarga continua con auto re-open y alinear manuales
</commit_message>
<xml_diff>
--- a/docs/CONFIGURACION_TECNICA_APPSHEET.docx
+++ b/docs/CONFIGURACION_TECNICA_APPSHEET.docx
@@ -12811,7 +12811,7 @@
               <w:rPr>
                 <w:b/>
               </w:rPr>
-              <w:t>Finish view</w:t>
+              <w:t>Auto re-open</w:t>
             </w:r>
           </w:p>
         </w:tc>
@@ -12836,7 +12836,7 @@
                 <w:rStyle w:val="Codigo_Inline"/>
                 <w:shd w:fill="F1F5F9"/>
               </w:rPr>
-              <w:t>REGISTRO_DIARIO_Form</w:t>
+              <w:t>ON</w:t>
             </w:r>
             <w:r>
               <w:t xml:space="preserve"> </w:t>
@@ -12845,7 +12845,7 @@
               <w:rPr>
                 <w:i/>
               </w:rPr>
-              <w:t>(al guardar, el formulario se recarga en blanco inmediatamente, listo para el siguiente despacho)</w:t>
+              <w:t>(activado para recarga continua del formulario sin límite de despachos)</w:t>
             </w:r>
           </w:p>
         </w:tc>
@@ -12874,7 +12874,7 @@
               <w:rPr>
                 <w:b/>
               </w:rPr>
-              <w:t>Display name</w:t>
+              <w:t>Finish view</w:t>
             </w:r>
           </w:p>
         </w:tc>
@@ -12899,7 +12899,16 @@
                 <w:rStyle w:val="Codigo_Inline"/>
                 <w:shd w:fill="F1F5F9"/>
               </w:rPr>
-              <w:t>NUEVO REGISTRO</w:t>
+              <w:t>Auto assign (Go Back)</w:t>
+            </w:r>
+            <w:r>
+              <w:t xml:space="preserve"> </w:t>
+            </w:r>
+            <w:r>
+              <w:rPr>
+                <w:i/>
+              </w:rPr>
+              <w:t>(al guardar, Auto re-open mantiene el formulario en blanco; al dar Cancel regresa a la vista previa)</w:t>
             </w:r>
           </w:p>
         </w:tc>
@@ -12928,7 +12937,7 @@
               <w:rPr>
                 <w:b/>
               </w:rPr>
-              <w:t>Icon</w:t>
+              <w:t>Display name</w:t>
             </w:r>
           </w:p>
         </w:tc>
@@ -12936,6 +12945,60 @@
           <w:tcPr>
             <w:tcW w:type="dxa" w:w="4703"/>
             <w:shd w:fill="F8FAFC"/>
+            <w:tcMar>
+              <w:top w:w="70" w:type="dxa"/>
+              <w:bottom w:w="70" w:type="dxa"/>
+              <w:left w:w="90" w:type="dxa"/>
+              <w:right w:w="90" w:type="dxa"/>
+            </w:tcMar>
+            <w:vAlign w:val="center"/>
+          </w:tcPr>
+          <w:p>
+            <w:pPr>
+              <w:pStyle w:val="Tabla_Dato"/>
+            </w:pPr>
+            <w:r>
+              <w:rPr>
+                <w:rStyle w:val="Codigo_Inline"/>
+                <w:shd w:fill="F1F5F9"/>
+              </w:rPr>
+              <w:t>NUEVO REGISTRO</w:t>
+            </w:r>
+          </w:p>
+        </w:tc>
+      </w:tr>
+      <w:tr>
+        <w:trPr>
+          <w:cantSplit/>
+        </w:trPr>
+        <w:tc>
+          <w:tcPr>
+            <w:tcW w:type="dxa" w:w="4703"/>
+            <w:shd w:fill="FFFFFF"/>
+            <w:tcMar>
+              <w:top w:w="70" w:type="dxa"/>
+              <w:bottom w:w="70" w:type="dxa"/>
+              <w:left w:w="90" w:type="dxa"/>
+              <w:right w:w="90" w:type="dxa"/>
+            </w:tcMar>
+            <w:vAlign w:val="center"/>
+          </w:tcPr>
+          <w:p>
+            <w:pPr>
+              <w:pStyle w:val="Tabla_Dato"/>
+            </w:pPr>
+            <w:r>
+              <w:rPr>
+                <w:b/>
+              </w:rPr>
+              <w:t>Icon</w:t>
+            </w:r>
+          </w:p>
+        </w:tc>
+        <w:tc>
+          <w:tcPr>
+            <w:tcW w:type="dxa" w:w="4703"/>
+            <w:shd w:fill="FFFFFF"/>
             <w:tcMar>
               <w:top w:w="70" w:type="dxa"/>
               <w:bottom w:w="70" w:type="dxa"/>
@@ -18168,13 +18231,13 @@
           <w:b/>
           <w:sz w:val="21"/>
         </w:rPr>
-        <w:t>Finish view:</w:t>
+        <w:t>Recarga continua:</w:t>
       </w:r>
       <w:r>
         <w:rPr>
           <w:sz w:val="21"/>
         </w:rPr>
-        <w:t xml:space="preserve"> Al guardar un despacho, el formulario se recarga automáticamente en blanco (</w:t>
+        <w:t xml:space="preserve"> Con </w:t>
       </w:r>
       <w:r>
         <w:rPr>
@@ -18182,13 +18245,27 @@
           <w:sz w:val="18"/>
           <w:shd w:fill="F1F5F9"/>
         </w:rPr>
-        <w:t>REGISTRO_DIARIO_Form</w:t>
+        <w:t>Auto re-open</w:t>
       </w:r>
       <w:r>
         <w:rPr>
           <w:sz w:val="21"/>
         </w:rPr>
-        <w:t>).</w:t>
+        <w:t xml:space="preserve"> activo y </w:t>
+      </w:r>
+      <w:r>
+        <w:rPr>
+          <w:rStyle w:val="Codigo_Inline"/>
+          <w:sz w:val="18"/>
+          <w:shd w:fill="F1F5F9"/>
+        </w:rPr>
+        <w:t>Finish view = Auto assign (Go Back)</w:t>
+      </w:r>
+      <w:r>
+        <w:rPr>
+          <w:sz w:val="21"/>
+        </w:rPr>
+        <w:t>, el formulario se recarga continuamente en blanco tras cada guardado para despachos masivos.</w:t>
       </w:r>
     </w:p>
     <w:p>

</xml_diff>

<commit_message>
fix(liquidacion): corregir consolidacion mensual por quincenas y detallar formulas analiticas
</commit_message>
<xml_diff>
--- a/docs/CONFIGURACION_TECNICA_APPSHEET.docx
+++ b/docs/CONFIGURACION_TECNICA_APPSHEET.docx
@@ -7942,7 +7942,68 @@
         <w:rPr>
           <w:sz w:val="22"/>
         </w:rPr>
-        <w:t>Ambas comparten la misma estructura de 7 columnas base provenientes de Google Sheets:</w:t>
+        <w:t>Ambas tablas exponen en AppSheet las mismas 7 columnas visibles de liquidación consolidada calculadas en Google Sheets.</w:t>
+      </w:r>
+    </w:p>
+    <w:p>
+      <w:pPr/>
+      <w:r>
+        <w:rPr>
+          <w:sz w:val="22"/>
+        </w:rPr>
+        <w:t xml:space="preserve">En </w:t>
+      </w:r>
+      <w:r>
+        <w:rPr>
+          <w:rStyle w:val="Codigo_Inline"/>
+          <w:shd w:fill="F1F5F9"/>
+        </w:rPr>
+        <w:t>RESUMEN_MENSUAL</w:t>
+      </w:r>
+      <w:r>
+        <w:rPr>
+          <w:sz w:val="22"/>
+        </w:rPr>
+        <w:t xml:space="preserve">, la liquidación corresponde a la </w:t>
+      </w:r>
+      <w:r>
+        <w:rPr>
+          <w:b/>
+          <w:sz w:val="22"/>
+        </w:rPr>
+        <w:t>suma financiera exacta de lo devengado en la Quincena 1 (días 1 al 15) más la Quincena 2 (días 16 al fin de mes)</w:t>
+      </w:r>
+      <w:r>
+        <w:rPr>
+          <w:sz w:val="22"/>
+        </w:rPr>
+        <w:t>. Para garantizar este desglose sin distorsionar las escalas quincenales, la hoja en Google Sheets contiene 8 columnas auxiliares de cálculo analítico (</w:t>
+      </w:r>
+      <w:r>
+        <w:rPr>
+          <w:rStyle w:val="Codigo_Inline"/>
+          <w:shd w:fill="F1F5F9"/>
+        </w:rPr>
+        <w:t>H:O</w:t>
+      </w:r>
+      <w:r>
+        <w:rPr>
+          <w:sz w:val="22"/>
+        </w:rPr>
+        <w:t xml:space="preserve">) que en AppSheet se mantienen con </w:t>
+      </w:r>
+      <w:r>
+        <w:rPr>
+          <w:rStyle w:val="Codigo_Inline"/>
+          <w:shd w:fill="F1F5F9"/>
+        </w:rPr>
+        <w:t>SHOW? = FALSE</w:t>
+      </w:r>
+      <w:r>
+        <w:rPr>
+          <w:sz w:val="22"/>
+        </w:rPr>
+        <w:t>.</w:t>
       </w:r>
     </w:p>
     <w:p>
@@ -9914,6 +9975,308 @@
         <w:spacing w:before="0" w:after="120"/>
       </w:pPr>
     </w:p>
+    <w:p>
+      <w:pPr>
+        <w:pStyle w:val="Heading3"/>
+      </w:pPr>
+      <w:r>
+        <w:rPr>
+          <w:b/>
+          <w:sz w:val="23"/>
+        </w:rPr>
+        <w:t xml:space="preserve">A.1. Columnas auxiliares de auditoría quincenal (Exclusivas de </w:t>
+      </w:r>
+      <w:r>
+        <w:rPr>
+          <w:rStyle w:val="Codigo_Inline"/>
+          <w:b/>
+          <w:sz w:val="20"/>
+          <w:shd w:fill="F1F5F9"/>
+        </w:rPr>
+        <w:t>RESUMEN_MENSUAL</w:t>
+      </w:r>
+      <w:r>
+        <w:rPr>
+          <w:b/>
+          <w:sz w:val="23"/>
+        </w:rPr>
+        <w:t>)</w:t>
+      </w:r>
+    </w:p>
+    <w:p>
+      <w:pPr/>
+      <w:r>
+        <w:rPr>
+          <w:i/>
+          <w:sz w:val="22"/>
+        </w:rPr>
+        <w:t>Las siguientes 8 columnas físicas existen en Google Sheets (</w:t>
+      </w:r>
+      <w:r>
+        <w:rPr>
+          <w:rStyle w:val="Codigo_Inline"/>
+          <w:i/>
+          <w:shd w:fill="F1F5F9"/>
+        </w:rPr>
+        <w:t>H:O</w:t>
+      </w:r>
+      <w:r>
+        <w:rPr>
+          <w:i/>
+          <w:sz w:val="22"/>
+        </w:rPr>
+        <w:t xml:space="preserve">) para desglosar la liquidación de cada quincena y se configuran en AppSheet con </w:t>
+      </w:r>
+      <w:r>
+        <w:rPr>
+          <w:rStyle w:val="Codigo_Inline"/>
+          <w:i/>
+          <w:shd w:fill="F1F5F9"/>
+        </w:rPr>
+        <w:t>SHOW? = FALSE</w:t>
+      </w:r>
+      <w:r>
+        <w:rPr>
+          <w:i/>
+          <w:sz w:val="22"/>
+        </w:rPr>
+        <w:t>:</w:t>
+      </w:r>
+    </w:p>
+    <w:p>
+      <w:pPr>
+        <w:pStyle w:val="ListBullet"/>
+      </w:pPr>
+      <w:r>
+        <w:rPr>
+          <w:rStyle w:val="Codigo_Inline"/>
+          <w:sz w:val="18"/>
+          <w:shd w:fill="F1F5F9"/>
+        </w:rPr>
+        <w:t>Puntos_Q1</w:t>
+      </w:r>
+      <w:r>
+        <w:rPr>
+          <w:sz w:val="21"/>
+        </w:rPr>
+        <w:t xml:space="preserve"> (</w:t>
+      </w:r>
+      <w:r>
+        <w:rPr>
+          <w:rStyle w:val="Codigo_Inline"/>
+          <w:sz w:val="18"/>
+          <w:shd w:fill="F1F5F9"/>
+        </w:rPr>
+        <w:t>Number</w:t>
+      </w:r>
+      <w:r>
+        <w:rPr>
+          <w:sz w:val="21"/>
+        </w:rPr>
+        <w:t xml:space="preserve">), </w:t>
+      </w:r>
+      <w:r>
+        <w:rPr>
+          <w:rStyle w:val="Codigo_Inline"/>
+          <w:sz w:val="18"/>
+          <w:shd w:fill="F1F5F9"/>
+        </w:rPr>
+        <w:t>Bono_Prod_Q1</w:t>
+      </w:r>
+      <w:r>
+        <w:rPr>
+          <w:sz w:val="21"/>
+        </w:rPr>
+        <w:t xml:space="preserve"> (</w:t>
+      </w:r>
+      <w:r>
+        <w:rPr>
+          <w:rStyle w:val="Codigo_Inline"/>
+          <w:sz w:val="18"/>
+          <w:shd w:fill="F1F5F9"/>
+        </w:rPr>
+        <w:t>Price</w:t>
+      </w:r>
+      <w:r>
+        <w:rPr>
+          <w:sz w:val="21"/>
+        </w:rPr>
+        <w:t xml:space="preserve">), </w:t>
+      </w:r>
+      <w:r>
+        <w:rPr>
+          <w:rStyle w:val="Codigo_Inline"/>
+          <w:sz w:val="18"/>
+          <w:shd w:fill="F1F5F9"/>
+        </w:rPr>
+        <w:t>Errores_Q1</w:t>
+      </w:r>
+      <w:r>
+        <w:rPr>
+          <w:sz w:val="21"/>
+        </w:rPr>
+        <w:t xml:space="preserve"> (</w:t>
+      </w:r>
+      <w:r>
+        <w:rPr>
+          <w:rStyle w:val="Codigo_Inline"/>
+          <w:sz w:val="18"/>
+          <w:shd w:fill="F1F5F9"/>
+        </w:rPr>
+        <w:t>Number</w:t>
+      </w:r>
+      <w:r>
+        <w:rPr>
+          <w:sz w:val="21"/>
+        </w:rPr>
+        <w:t xml:space="preserve">), </w:t>
+      </w:r>
+      <w:r>
+        <w:rPr>
+          <w:rStyle w:val="Codigo_Inline"/>
+          <w:sz w:val="18"/>
+          <w:shd w:fill="F1F5F9"/>
+        </w:rPr>
+        <w:t>Bono_Cal_Q1</w:t>
+      </w:r>
+      <w:r>
+        <w:rPr>
+          <w:sz w:val="21"/>
+        </w:rPr>
+        <w:t xml:space="preserve"> (</w:t>
+      </w:r>
+      <w:r>
+        <w:rPr>
+          <w:rStyle w:val="Codigo_Inline"/>
+          <w:sz w:val="18"/>
+          <w:shd w:fill="F1F5F9"/>
+        </w:rPr>
+        <w:t>Price</w:t>
+      </w:r>
+      <w:r>
+        <w:rPr>
+          <w:sz w:val="21"/>
+        </w:rPr>
+        <w:t>).</w:t>
+      </w:r>
+    </w:p>
+    <w:p>
+      <w:pPr>
+        <w:pStyle w:val="ListBullet"/>
+      </w:pPr>
+      <w:r>
+        <w:rPr>
+          <w:rStyle w:val="Codigo_Inline"/>
+          <w:sz w:val="18"/>
+          <w:shd w:fill="F1F5F9"/>
+        </w:rPr>
+        <w:t>Puntos_Q2</w:t>
+      </w:r>
+      <w:r>
+        <w:rPr>
+          <w:sz w:val="21"/>
+        </w:rPr>
+        <w:t xml:space="preserve"> (</w:t>
+      </w:r>
+      <w:r>
+        <w:rPr>
+          <w:rStyle w:val="Codigo_Inline"/>
+          <w:sz w:val="18"/>
+          <w:shd w:fill="F1F5F9"/>
+        </w:rPr>
+        <w:t>Number</w:t>
+      </w:r>
+      <w:r>
+        <w:rPr>
+          <w:sz w:val="21"/>
+        </w:rPr>
+        <w:t xml:space="preserve">), </w:t>
+      </w:r>
+      <w:r>
+        <w:rPr>
+          <w:rStyle w:val="Codigo_Inline"/>
+          <w:sz w:val="18"/>
+          <w:shd w:fill="F1F5F9"/>
+        </w:rPr>
+        <w:t>Bono_Prod_Q2</w:t>
+      </w:r>
+      <w:r>
+        <w:rPr>
+          <w:sz w:val="21"/>
+        </w:rPr>
+        <w:t xml:space="preserve"> (</w:t>
+      </w:r>
+      <w:r>
+        <w:rPr>
+          <w:rStyle w:val="Codigo_Inline"/>
+          <w:sz w:val="18"/>
+          <w:shd w:fill="F1F5F9"/>
+        </w:rPr>
+        <w:t>Price</w:t>
+      </w:r>
+      <w:r>
+        <w:rPr>
+          <w:sz w:val="21"/>
+        </w:rPr>
+        <w:t xml:space="preserve">), </w:t>
+      </w:r>
+      <w:r>
+        <w:rPr>
+          <w:rStyle w:val="Codigo_Inline"/>
+          <w:sz w:val="18"/>
+          <w:shd w:fill="F1F5F9"/>
+        </w:rPr>
+        <w:t>Errores_Q2</w:t>
+      </w:r>
+      <w:r>
+        <w:rPr>
+          <w:sz w:val="21"/>
+        </w:rPr>
+        <w:t xml:space="preserve"> (</w:t>
+      </w:r>
+      <w:r>
+        <w:rPr>
+          <w:rStyle w:val="Codigo_Inline"/>
+          <w:sz w:val="18"/>
+          <w:shd w:fill="F1F5F9"/>
+        </w:rPr>
+        <w:t>Number</w:t>
+      </w:r>
+      <w:r>
+        <w:rPr>
+          <w:sz w:val="21"/>
+        </w:rPr>
+        <w:t xml:space="preserve">), </w:t>
+      </w:r>
+      <w:r>
+        <w:rPr>
+          <w:rStyle w:val="Codigo_Inline"/>
+          <w:sz w:val="18"/>
+          <w:shd w:fill="F1F5F9"/>
+        </w:rPr>
+        <w:t>Bono_Cal_Q2</w:t>
+      </w:r>
+      <w:r>
+        <w:rPr>
+          <w:sz w:val="21"/>
+        </w:rPr>
+        <w:t xml:space="preserve"> (</w:t>
+      </w:r>
+      <w:r>
+        <w:rPr>
+          <w:rStyle w:val="Codigo_Inline"/>
+          <w:sz w:val="18"/>
+          <w:shd w:fill="F1F5F9"/>
+        </w:rPr>
+        <w:t>Price</w:t>
+      </w:r>
+      <w:r>
+        <w:rPr>
+          <w:sz w:val="21"/>
+        </w:rPr>
+        <w:t>).</w:t>
+      </w:r>
+    </w:p>
     <w:tbl>
       <w:tblPr>
         <w:tblW w:type="auto" w:w="0"/>
@@ -10080,7 +10443,7 @@
                 <w:b/>
                 <w:sz w:val="21"/>
               </w:rPr>
-              <w:t>):</w:t>
+              <w:t xml:space="preserve"> y auxiliares):</w:t>
             </w:r>
           </w:p>
           <w:p>

</xml_diff>